<commit_message>
Ajusta business plan: remove menções a produção e reconstrução
- Reposiciona maturidade como "MVP construído e testado, pronto para
  piloto" (pré-lançamento), sem alegar uso em produção.
- Remove todas as referências à reconstrução do código (SWOT, riscos,
  status do produto, slides de produto/tese).
- Substitui o risco de "titularidade do código" por "product-market fit
  não comprovado", coerente com o estágio.
- Renomeia scripts de geração para .cjs (compatíveis com o pacote ESM da
  raiz) e adiciona package.json + .gitignore da pasta.

Co-Authored-By: Claude Opus 4.8 <noreply@anthropic.com>
</commit_message>
<xml_diff>
--- a/business-plan/HealthMatch_Business_Plan.docx
+++ b/business-plan/HealthMatch_Business_Plan.docx
@@ -1229,7 +1229,7 @@
                 <w:sz w:val="18"/>
                 <w:szCs w:val="18"/>
               </w:rPr>
-              <w:t xml:space="preserve">Funcionalmente completo (já operou em produção; base de código reconstruída e auditada)</w:t>
+              <w:t xml:space="preserve">Funcionalmente completo e testado internamente; pronto para o primeiro piloto</w:t>
             </w:r>
           </w:p>
         </w:tc>
@@ -4527,7 +4527,7 @@
           <w:sz w:val="22"/>
           <w:szCs w:val="22"/>
         </w:rPr>
-        <w:t xml:space="preserve">MVP maduro / pronto para produção. O produto já operou em produção e foi reconstruído com paridade 1:1 validada. Lacunas para escala (no roadmap): multi-tenancy robusto, billing automatizado (gateway/split), observabilidade, testes de carga e ativação plena da IA em produção.</w:t>
+        <w:t xml:space="preserve">MVP construído e testado internamente, pronto para o primeiro piloto. Lacunas para escala (no roadmap): multi-tenancy robusto, billing automatizado (gateway/split), observabilidade, testes de carga e ativação plena do agente de IA.</w:t>
       </w:r>
     </w:p>
     <w:p>
@@ -10391,7 +10391,7 @@
                 <w:sz w:val="18"/>
                 <w:szCs w:val="18"/>
               </w:rPr>
-              <w:t xml:space="preserve">Produto pronto e já validado em produção</w:t>
+              <w:t xml:space="preserve">Produto construído e testado, pronto para piloto</w:t>
             </w:r>
           </w:p>
           <w:p>
@@ -10571,7 +10571,7 @@
                 <w:sz w:val="18"/>
                 <w:szCs w:val="18"/>
               </w:rPr>
-              <w:t xml:space="preserve">Código é reconstrução (titularidade de IP a blindar)</w:t>
+              <w:t xml:space="preserve">Produto ainda sem validação com clientes reais</w:t>
             </w:r>
           </w:p>
         </w:tc>
@@ -11087,7 +11087,7 @@
                 <w:sz w:val="18"/>
                 <w:szCs w:val="18"/>
               </w:rPr>
-              <w:t xml:space="preserve">Titularidade do código (reconstrução)</w:t>
+              <w:t xml:space="preserve">Product-market fit ainda não comprovado</w:t>
             </w:r>
           </w:p>
         </w:tc>
@@ -11151,7 +11151,7 @@
                 <w:sz w:val="18"/>
                 <w:szCs w:val="18"/>
               </w:rPr>
-              <w:t xml:space="preserve">Due diligence de IP: garantir cessão/propriedade limpa do código e dos dados antes da rodada</w:t>
+              <w:t xml:space="preserve">Piloto rápido com a âncora, com métricas de sucesso definidas (tempo de preenchimento, % de plantões descobertos)</w:t>
             </w:r>
           </w:p>
         </w:tc>

</xml_diff>